<commit_message>
feat: create lab4, install package
</commit_message>
<xml_diff>
--- a/docx/lab3.docx
+++ b/docx/lab3.docx
@@ -516,8 +516,149 @@
           <w:bCs/>
         </w:rPr>
       </w:pPr>
-    </w:p>
-    <w:p>
+      <w:r>
+        <w:rPr>
+          <w:noProof/>
+        </w:rPr>
+        <w:drawing>
+          <wp:inline distT="0" distB="0" distL="0" distR="0" wp14:anchorId="23A46DD2" wp14:editId="35F81E61">
+            <wp:extent cx="6120765" cy="414020"/>
+            <wp:effectExtent l="0" t="0" r="0" b="5080"/>
+            <wp:docPr id="1" name="Picture 1"/>
+            <wp:cNvGraphicFramePr>
+              <a:graphicFrameLocks xmlns:a="http://schemas.openxmlformats.org/drawingml/2006/main" noChangeAspect="1"/>
+            </wp:cNvGraphicFramePr>
+            <a:graphic xmlns:a="http://schemas.openxmlformats.org/drawingml/2006/main">
+              <a:graphicData uri="http://schemas.openxmlformats.org/drawingml/2006/picture">
+                <pic:pic xmlns:pic="http://schemas.openxmlformats.org/drawingml/2006/picture">
+                  <pic:nvPicPr>
+                    <pic:cNvPr id="1" name=""/>
+                    <pic:cNvPicPr/>
+                  </pic:nvPicPr>
+                  <pic:blipFill>
+                    <a:blip r:embed="rId4"/>
+                    <a:stretch>
+                      <a:fillRect/>
+                    </a:stretch>
+                  </pic:blipFill>
+                  <pic:spPr>
+                    <a:xfrm>
+                      <a:off x="0" y="0"/>
+                      <a:ext cx="6120765" cy="414020"/>
+                    </a:xfrm>
+                    <a:prstGeom prst="rect">
+                      <a:avLst/>
+                    </a:prstGeom>
+                  </pic:spPr>
+                </pic:pic>
+              </a:graphicData>
+            </a:graphic>
+          </wp:inline>
+        </w:drawing>
+      </w:r>
+    </w:p>
+    <w:p>
+      <w:pPr>
+        <w:rPr>
+          <w:b/>
+          <w:bCs/>
+        </w:rPr>
+      </w:pPr>
+      <w:r>
+        <w:rPr>
+          <w:noProof/>
+        </w:rPr>
+        <w:drawing>
+          <wp:inline distT="0" distB="0" distL="0" distR="0" wp14:anchorId="2E310ACC" wp14:editId="20F9773A">
+            <wp:extent cx="6120765" cy="133350"/>
+            <wp:effectExtent l="0" t="0" r="0" b="0"/>
+            <wp:docPr id="3" name="Picture 3"/>
+            <wp:cNvGraphicFramePr>
+              <a:graphicFrameLocks xmlns:a="http://schemas.openxmlformats.org/drawingml/2006/main" noChangeAspect="1"/>
+            </wp:cNvGraphicFramePr>
+            <a:graphic xmlns:a="http://schemas.openxmlformats.org/drawingml/2006/main">
+              <a:graphicData uri="http://schemas.openxmlformats.org/drawingml/2006/picture">
+                <pic:pic xmlns:pic="http://schemas.openxmlformats.org/drawingml/2006/picture">
+                  <pic:nvPicPr>
+                    <pic:cNvPr id="1" name=""/>
+                    <pic:cNvPicPr/>
+                  </pic:nvPicPr>
+                  <pic:blipFill>
+                    <a:blip r:embed="rId5"/>
+                    <a:stretch>
+                      <a:fillRect/>
+                    </a:stretch>
+                  </pic:blipFill>
+                  <pic:spPr>
+                    <a:xfrm>
+                      <a:off x="0" y="0"/>
+                      <a:ext cx="6120765" cy="133350"/>
+                    </a:xfrm>
+                    <a:prstGeom prst="rect">
+                      <a:avLst/>
+                    </a:prstGeom>
+                  </pic:spPr>
+                </pic:pic>
+              </a:graphicData>
+            </a:graphic>
+          </wp:inline>
+        </w:drawing>
+      </w:r>
+    </w:p>
+    <w:p>
+      <w:pPr>
+        <w:rPr>
+          <w:b/>
+          <w:bCs/>
+        </w:rPr>
+      </w:pPr>
+      <w:r>
+        <w:rPr>
+          <w:noProof/>
+        </w:rPr>
+        <w:drawing>
+          <wp:inline distT="0" distB="0" distL="0" distR="0" wp14:anchorId="6995ECE6" wp14:editId="37AE2AD7">
+            <wp:extent cx="1457325" cy="247650"/>
+            <wp:effectExtent l="0" t="0" r="9525" b="0"/>
+            <wp:docPr id="4" name="Picture 4"/>
+            <wp:cNvGraphicFramePr>
+              <a:graphicFrameLocks xmlns:a="http://schemas.openxmlformats.org/drawingml/2006/main" noChangeAspect="1"/>
+            </wp:cNvGraphicFramePr>
+            <a:graphic xmlns:a="http://schemas.openxmlformats.org/drawingml/2006/main">
+              <a:graphicData uri="http://schemas.openxmlformats.org/drawingml/2006/picture">
+                <pic:pic xmlns:pic="http://schemas.openxmlformats.org/drawingml/2006/picture">
+                  <pic:nvPicPr>
+                    <pic:cNvPr id="1" name=""/>
+                    <pic:cNvPicPr/>
+                  </pic:nvPicPr>
+                  <pic:blipFill>
+                    <a:blip r:embed="rId6"/>
+                    <a:stretch>
+                      <a:fillRect/>
+                    </a:stretch>
+                  </pic:blipFill>
+                  <pic:spPr>
+                    <a:xfrm>
+                      <a:off x="0" y="0"/>
+                      <a:ext cx="1457325" cy="247650"/>
+                    </a:xfrm>
+                    <a:prstGeom prst="rect">
+                      <a:avLst/>
+                    </a:prstGeom>
+                  </pic:spPr>
+                </pic:pic>
+              </a:graphicData>
+            </a:graphic>
+          </wp:inline>
+        </w:drawing>
+      </w:r>
+    </w:p>
+    <w:p>
+      <w:pPr>
+        <w:rPr>
+          <w:lang w:val="en-US"/>
+        </w:rPr>
+      </w:pPr>
       <w:r>
         <w:rPr>
           <w:b/>
@@ -557,7 +698,7 @@
           <w:lang w:val="en-US"/>
         </w:rPr>
       </w:pPr>
-      <w:hyperlink r:id="rId4" w:history="1">
+      <w:hyperlink r:id="rId7" w:history="1">
         <w:r>
           <w:rPr>
             <w:rStyle w:val="Hyperlink"/>

</xml_diff>